<commit_message>
Update evaluation insights and app screenshots
</commit_message>
<xml_diff>
--- a/docs/Divya Sahni- Week-2 Project- TM Forum-RAG Assistant.docx
+++ b/docs/Divya Sahni- Week-2 Project- TM Forum-RAG Assistant.docx
@@ -485,7 +485,15 @@
           </w:tcPr>
           <w:p>
             <w:r>
-              <w:t>The prototype uses manually downloaded, versioned TM Forum specifications as a static corpus. When a specification changes, the new document can be re-ingested and incrementally embedded/upserted into the vector store.</w:t>
+              <w:t>The prototype uses manually downloaded, versioned TM Forum specifications as a static corpus. When a specification changes, the new document can be re-ingested and incrementally embedded/</w:t>
+            </w:r>
+            <w:proofErr w:type="spellStart"/>
+            <w:r>
+              <w:t>upserted</w:t>
+            </w:r>
+            <w:proofErr w:type="spellEnd"/>
+            <w:r>
+              <w:t xml:space="preserve"> into the vector store.</w:t>
             </w:r>
           </w:p>
         </w:tc>
@@ -528,7 +536,15 @@
               <w:t>1,000-character chunks and 150-character overlap</w:t>
             </w:r>
             <w:r>
-              <w:t xml:space="preserve">, with very small chunks removed. Chunks are enriched with contextual metadata and embedded using Nebius Qwen/Qwen3-Embedding-8B, producing </w:t>
+              <w:t xml:space="preserve">, with very small chunks removed. Chunks are enriched with contextual metadata and embedded using </w:t>
+            </w:r>
+            <w:proofErr w:type="spellStart"/>
+            <w:r>
+              <w:t>Nebius</w:t>
+            </w:r>
+            <w:proofErr w:type="spellEnd"/>
+            <w:r>
+              <w:t xml:space="preserve"> Qwen/Qwen3-Embedding-8B, producing </w:t>
             </w:r>
             <w:r>
               <w:rPr>
@@ -608,8 +624,17 @@
                 <w:b/>
                 <w:bCs/>
               </w:rPr>
-              <w:t>LLM reranker</w:t>
-            </w:r>
+              <w:t xml:space="preserve">LLM </w:t>
+            </w:r>
+            <w:proofErr w:type="spellStart"/>
+            <w:r>
+              <w:rPr>
+                <w:b/>
+                <w:bCs/>
+              </w:rPr>
+              <w:t>reranker</w:t>
+            </w:r>
+            <w:proofErr w:type="spellEnd"/>
             <w:r>
               <w:t>.</w:t>
             </w:r>
@@ -677,8 +702,13 @@
             <w:hideMark/>
           </w:tcPr>
           <w:p>
-            <w:r>
-              <w:t>LangGraph performs an evidence-sufficiency check before generation. If sufficient evidence is unavailable, the assistant responds that it could not find enough information instead of fabricating an answer.</w:t>
+            <w:proofErr w:type="spellStart"/>
+            <w:r>
+              <w:t>LangGraph</w:t>
+            </w:r>
+            <w:proofErr w:type="spellEnd"/>
+            <w:r>
+              <w:t xml:space="preserve"> performs an evidence-sufficiency check before generation. If sufficient evidence is unavailable, the assistant responds that it could not find enough information instead of fabricating an answer.</w:t>
             </w:r>
           </w:p>
         </w:tc>
@@ -1233,9 +1263,11 @@
       </w:r>
     </w:p>
     <w:p>
+      <w:proofErr w:type="spellStart"/>
       <w:r>
         <w:t>field_definition</w:t>
       </w:r>
+      <w:proofErr w:type="spellEnd"/>
     </w:p>
     <w:p>
       <w:r>
@@ -1243,9 +1275,11 @@
       </w:r>
     </w:p>
     <w:p>
+      <w:proofErr w:type="spellStart"/>
       <w:r>
         <w:t>json_example</w:t>
       </w:r>
+      <w:proofErr w:type="spellEnd"/>
     </w:p>
     <w:p>
       <w:r>
@@ -1274,14 +1308,18 @@
       </w:r>
     </w:p>
     <w:p>
+      <w:proofErr w:type="spellStart"/>
       <w:r>
         <w:t>api_id</w:t>
       </w:r>
-    </w:p>
-    <w:p>
+      <w:proofErr w:type="spellEnd"/>
+    </w:p>
+    <w:p>
+      <w:proofErr w:type="spellStart"/>
       <w:r>
         <w:t>api_name</w:t>
       </w:r>
+      <w:proofErr w:type="spellEnd"/>
     </w:p>
     <w:p>
       <w:r>
@@ -1294,14 +1332,18 @@
       </w:r>
     </w:p>
     <w:p>
+      <w:proofErr w:type="spellStart"/>
       <w:r>
         <w:t>chunk_id</w:t>
       </w:r>
-    </w:p>
-    <w:p>
+      <w:proofErr w:type="spellEnd"/>
+    </w:p>
+    <w:p>
+      <w:proofErr w:type="spellStart"/>
       <w:r>
         <w:t>content_type</w:t>
       </w:r>
+      <w:proofErr w:type="spellEnd"/>
     </w:p>
     <w:p>
       <w:r>
@@ -1329,13 +1371,23 @@
       </w:r>
     </w:p>
     <w:p>
-      <w:r>
-        <w:t>api_id:       TMF622</w:t>
-      </w:r>
-    </w:p>
-    <w:p>
-      <w:r>
-        <w:t>api_name:     Product Ordering Management</w:t>
+      <w:proofErr w:type="spellStart"/>
+      <w:r>
+        <w:t>api_id</w:t>
+      </w:r>
+      <w:proofErr w:type="spellEnd"/>
+      <w:r>
+        <w:t>:       TMF622</w:t>
+      </w:r>
+    </w:p>
+    <w:p>
+      <w:proofErr w:type="spellStart"/>
+      <w:r>
+        <w:t>api_name</w:t>
+      </w:r>
+      <w:proofErr w:type="spellEnd"/>
+      <w:r>
+        <w:t>:     Product Ordering Management</w:t>
       </w:r>
     </w:p>
     <w:p>
@@ -1349,14 +1401,29 @@
       </w:r>
     </w:p>
     <w:p>
-      <w:r>
-        <w:t>chunk_id:     TMF622_0293</w:t>
-      </w:r>
-    </w:p>
-    <w:p>
-      <w:r>
-        <w:t>content_type: json_example</w:t>
-      </w:r>
+      <w:proofErr w:type="spellStart"/>
+      <w:r>
+        <w:t>chunk_id</w:t>
+      </w:r>
+      <w:proofErr w:type="spellEnd"/>
+      <w:r>
+        <w:t>:     TMF622_0293</w:t>
+      </w:r>
+    </w:p>
+    <w:p>
+      <w:proofErr w:type="spellStart"/>
+      <w:r>
+        <w:t>content_type</w:t>
+      </w:r>
+      <w:proofErr w:type="spellEnd"/>
+      <w:r>
+        <w:t xml:space="preserve">: </w:t>
+      </w:r>
+      <w:proofErr w:type="spellStart"/>
+      <w:r>
+        <w:t>json_example</w:t>
+      </w:r>
+      <w:proofErr w:type="spellEnd"/>
     </w:p>
     <w:p>
       <w:r>
@@ -1365,7 +1432,15 @@
     </w:p>
     <w:p>
       <w:r>
-        <w:t>TMF622 Product Ordering Management | json_example | Page 154</w:t>
+        <w:t xml:space="preserve">TMF622 Product Ordering Management | </w:t>
+      </w:r>
+      <w:proofErr w:type="spellStart"/>
+      <w:r>
+        <w:t>json_example</w:t>
+      </w:r>
+      <w:proofErr w:type="spellEnd"/>
+      <w:r>
+        <w:t xml:space="preserve"> | Page 154</w:t>
       </w:r>
     </w:p>
     <w:p>
@@ -1420,8 +1495,13 @@
         <w:t>Provider:</w:t>
       </w:r>
       <w:r>
-        <w:t xml:space="preserve"> Nebius</w:t>
-      </w:r>
+        <w:t xml:space="preserve"> </w:t>
+      </w:r>
+      <w:proofErr w:type="spellStart"/>
+      <w:r>
+        <w:t>Nebius</w:t>
+      </w:r>
+      <w:proofErr w:type="spellEnd"/>
       <w:r>
         <w:br/>
       </w:r>
@@ -1478,7 +1558,15 @@
         <w:t>364 new chunks</w:t>
       </w:r>
       <w:r>
-        <w:t xml:space="preserve"> were embedded and upserted:</w:t>
+        <w:t xml:space="preserve"> were embedded and </w:t>
+      </w:r>
+      <w:proofErr w:type="spellStart"/>
+      <w:r>
+        <w:t>upserted</w:t>
+      </w:r>
+      <w:proofErr w:type="spellEnd"/>
+      <w:r>
+        <w:t>:</w:t>
       </w:r>
     </w:p>
     <w:p>
@@ -1576,12 +1664,28 @@
     <w:p>
       <w:r>
         <w:lastRenderedPageBreak/>
-        <w:t>What is a BillingAccount?</w:t>
-      </w:r>
-    </w:p>
-    <w:p>
-      <w:r>
-        <w:t>returned BillingAccount JSON examples rather than the concise conceptual definition.</w:t>
+        <w:t xml:space="preserve">What is a </w:t>
+      </w:r>
+      <w:proofErr w:type="spellStart"/>
+      <w:r>
+        <w:t>BillingAccount</w:t>
+      </w:r>
+      <w:proofErr w:type="spellEnd"/>
+      <w:r>
+        <w:t>?</w:t>
+      </w:r>
+    </w:p>
+    <w:p>
+      <w:r>
+        <w:t xml:space="preserve">returned </w:t>
+      </w:r>
+      <w:proofErr w:type="spellStart"/>
+      <w:r>
+        <w:t>BillingAccount</w:t>
+      </w:r>
+      <w:proofErr w:type="spellEnd"/>
+      <w:r>
+        <w:t xml:space="preserve"> JSON examples rather than the concise conceptual definition.</w:t>
       </w:r>
     </w:p>
     <w:p>
@@ -1622,14 +1726,18 @@
       </w:r>
     </w:p>
     <w:p>
+      <w:proofErr w:type="spellStart"/>
       <w:r>
         <w:t>BillingAccount</w:t>
       </w:r>
-    </w:p>
-    <w:p>
+      <w:proofErr w:type="spellEnd"/>
+    </w:p>
+    <w:p>
+      <w:proofErr w:type="spellStart"/>
       <w:r>
         <w:t>CustomerBill</w:t>
       </w:r>
+      <w:proofErr w:type="spellEnd"/>
     </w:p>
     <w:p>
       <w:r>
@@ -1652,9 +1760,11 @@
       </w:r>
     </w:p>
     <w:p>
+      <w:proofErr w:type="spellStart"/>
       <w:r>
         <w:t>CustomerBill</w:t>
       </w:r>
+      <w:proofErr w:type="spellEnd"/>
     </w:p>
     <w:p>
       <w:r>
@@ -1662,9 +1772,11 @@
       </w:r>
     </w:p>
     <w:p>
+      <w:proofErr w:type="spellStart"/>
       <w:r>
         <w:t>customerbill</w:t>
       </w:r>
+      <w:proofErr w:type="spellEnd"/>
     </w:p>
     <w:p>
       <w:r>
@@ -1722,15 +1834,19 @@
       </w:r>
     </w:p>
     <w:p>
+      <w:proofErr w:type="spellStart"/>
       <w:r>
         <w:t>totalAmount</w:t>
       </w:r>
-    </w:p>
-    <w:p>
+      <w:proofErr w:type="spellEnd"/>
+    </w:p>
+    <w:p>
+      <w:proofErr w:type="spellStart"/>
       <w:r>
         <w:lastRenderedPageBreak/>
         <w:t>paymentMethod</w:t>
       </w:r>
+      <w:proofErr w:type="spellEnd"/>
     </w:p>
     <w:p>
       <w:r>
@@ -1875,12 +1991,36 @@
     </w:p>
     <w:p>
       <w:r>
-        <w:t>An LLM-based reranker was added after a dedicated reranker model was unavailable through the selected provider.</w:t>
-      </w:r>
-    </w:p>
-    <w:p>
-      <w:r>
-        <w:t>The reranker receives the user's question plus hybrid-retrieval candidates and ranks them according to how directly they answer the question.</w:t>
+        <w:t xml:space="preserve">An LLM-based </w:t>
+      </w:r>
+      <w:proofErr w:type="spellStart"/>
+      <w:r>
+        <w:t>reranker</w:t>
+      </w:r>
+      <w:proofErr w:type="spellEnd"/>
+      <w:r>
+        <w:t xml:space="preserve"> was added after a dedicated </w:t>
+      </w:r>
+      <w:proofErr w:type="spellStart"/>
+      <w:r>
+        <w:t>reranker</w:t>
+      </w:r>
+      <w:proofErr w:type="spellEnd"/>
+      <w:r>
+        <w:t xml:space="preserve"> model was unavailable through the selected provider.</w:t>
+      </w:r>
+    </w:p>
+    <w:p>
+      <w:r>
+        <w:t xml:space="preserve">The </w:t>
+      </w:r>
+      <w:proofErr w:type="spellStart"/>
+      <w:r>
+        <w:t>reranker</w:t>
+      </w:r>
+      <w:proofErr w:type="spellEnd"/>
+      <w:r>
+        <w:t xml:space="preserve"> receives the user's question plus hybrid-retrieval candidates and ranks them according to how directly they answer the question.</w:t>
       </w:r>
     </w:p>
     <w:p>
@@ -1895,7 +2035,15 @@
     </w:p>
     <w:p>
       <w:r>
-        <w:t>What is a BillingAccount?</w:t>
+        <w:t xml:space="preserve">What is a </w:t>
+      </w:r>
+      <w:proofErr w:type="spellStart"/>
+      <w:r>
+        <w:t>BillingAccount</w:t>
+      </w:r>
+      <w:proofErr w:type="spellEnd"/>
+      <w:r>
+        <w:t>?</w:t>
       </w:r>
     </w:p>
     <w:p>
@@ -1915,8 +2063,13 @@
       </w:r>
     </w:p>
     <w:p>
-      <w:r>
-        <w:t>the Create payment section was ranked above the nearly identical Create refund section.</w:t>
+      <w:proofErr w:type="spellStart"/>
+      <w:r>
+        <w:t>the</w:t>
+      </w:r>
+      <w:proofErr w:type="spellEnd"/>
+      <w:r>
+        <w:t xml:space="preserve"> Create payment section was ranked above the nearly identical Create refund section.</w:t>
       </w:r>
     </w:p>
     <w:p>
@@ -2065,7 +2218,15 @@
         <w:pStyle w:val="Heading3"/>
       </w:pPr>
       <w:r>
-        <w:t>Iteration 6 — LangGraph Evidence Gate</w:t>
+        <w:t xml:space="preserve">Iteration 6 — </w:t>
+      </w:r>
+      <w:proofErr w:type="spellStart"/>
+      <w:r>
+        <w:t>LangGraph</w:t>
+      </w:r>
+      <w:proofErr w:type="spellEnd"/>
+      <w:r>
+        <w:t xml:space="preserve"> Evidence Gate</w:t>
       </w:r>
     </w:p>
     <w:p>
@@ -2079,8 +2240,13 @@
       </w:r>
     </w:p>
     <w:p>
-      <w:r>
-        <w:t>LangGraph was introduced to create an explicit evidence-check branch.</w:t>
+      <w:proofErr w:type="spellStart"/>
+      <w:r>
+        <w:t>LangGraph</w:t>
+      </w:r>
+      <w:proofErr w:type="spellEnd"/>
+      <w:r>
+        <w:t xml:space="preserve"> was introduced to create an explicit evidence-check branch.</w:t>
       </w:r>
     </w:p>
     <w:p>
@@ -2097,8 +2263,18 @@
           <w:bCs/>
           <w:color w:val="4C94D8" w:themeColor="text2" w:themeTint="80"/>
         </w:rPr>
-        <w:t>Retrieve + rerank</w:t>
-      </w:r>
+        <w:t xml:space="preserve">Retrieve + </w:t>
+      </w:r>
+      <w:proofErr w:type="spellStart"/>
+      <w:r>
+        <w:rPr>
+          <w:b/>
+          <w:bCs/>
+          <w:color w:val="4C94D8" w:themeColor="text2" w:themeTint="80"/>
+        </w:rPr>
+        <w:t>rerank</w:t>
+      </w:r>
+      <w:proofErr w:type="spellEnd"/>
     </w:p>
     <w:p>
       <w:pPr>
@@ -2248,9 +2424,11 @@
       </w:r>
     </w:p>
     <w:p>
+      <w:proofErr w:type="spellStart"/>
       <w:r>
         <w:t>chunk_ids</w:t>
       </w:r>
+      <w:proofErr w:type="spellEnd"/>
     </w:p>
     <w:p>
       <w:r>
@@ -2258,9 +2436,11 @@
       </w:r>
     </w:p>
     <w:p>
+      <w:proofErr w:type="spellStart"/>
       <w:r>
         <w:t>evidence_sufficient</w:t>
       </w:r>
+      <w:proofErr w:type="spellEnd"/>
     </w:p>
     <w:p>
       <w:r>
@@ -2549,23 +2729,33 @@
           <w:bCs/>
           <w:color w:val="4C94D8" w:themeColor="text2" w:themeTint="80"/>
         </w:rPr>
-        <w:t xml:space="preserve">                     LLM Reranker</w:t>
-      </w:r>
-    </w:p>
-    <w:p>
-      <w:pPr>
+        <w:t xml:space="preserve">                     LLM </w:t>
+      </w:r>
+      <w:proofErr w:type="spellStart"/>
+      <w:r>
         <w:rPr>
           <w:b/>
           <w:bCs/>
           <w:color w:val="4C94D8" w:themeColor="text2" w:themeTint="80"/>
         </w:rPr>
-      </w:pPr>
-      <w:r>
+        <w:t>Reranker</w:t>
+      </w:r>
+      <w:proofErr w:type="spellEnd"/>
+    </w:p>
+    <w:p>
+      <w:pPr>
         <w:rPr>
           <w:b/>
           <w:bCs/>
           <w:color w:val="4C94D8" w:themeColor="text2" w:themeTint="80"/>
         </w:rPr>
+      </w:pPr>
+      <w:r>
+        <w:rPr>
+          <w:b/>
+          <w:bCs/>
+          <w:color w:val="4C94D8" w:themeColor="text2" w:themeTint="80"/>
+        </w:rPr>
         <w:t xml:space="preserve">                          │</w:t>
       </w:r>
     </w:p>
@@ -2583,7 +2773,25 @@
           <w:bCs/>
           <w:color w:val="4C94D8" w:themeColor="text2" w:themeTint="80"/>
         </w:rPr>
-        <w:t xml:space="preserve">               LangGraph Evidence Check</w:t>
+        <w:t xml:space="preserve">               </w:t>
+      </w:r>
+      <w:proofErr w:type="spellStart"/>
+      <w:r>
+        <w:rPr>
+          <w:b/>
+          <w:bCs/>
+          <w:color w:val="4C94D8" w:themeColor="text2" w:themeTint="80"/>
+        </w:rPr>
+        <w:t>LangGraph</w:t>
+      </w:r>
+      <w:proofErr w:type="spellEnd"/>
+      <w:r>
+        <w:rPr>
+          <w:b/>
+          <w:bCs/>
+          <w:color w:val="4C94D8" w:themeColor="text2" w:themeTint="80"/>
+        </w:rPr>
+        <w:t xml:space="preserve"> Evidence Check</w:t>
       </w:r>
     </w:p>
     <w:p>
@@ -2818,8 +3026,13 @@
             <w:hideMark/>
           </w:tcPr>
           <w:p>
-            <w:r>
-              <w:t>LangChain recursive text splitting</w:t>
+            <w:proofErr w:type="spellStart"/>
+            <w:r>
+              <w:t>LangChain</w:t>
+            </w:r>
+            <w:proofErr w:type="spellEnd"/>
+            <w:r>
+              <w:t xml:space="preserve"> recursive text splitting</w:t>
             </w:r>
           </w:p>
         </w:tc>
@@ -2847,8 +3060,13 @@
             <w:hideMark/>
           </w:tcPr>
           <w:p>
-            <w:r>
-              <w:t>Nebius / Qwen3-Embedding-8B</w:t>
+            <w:proofErr w:type="spellStart"/>
+            <w:r>
+              <w:t>Nebius</w:t>
+            </w:r>
+            <w:proofErr w:type="spellEnd"/>
+            <w:r>
+              <w:t xml:space="preserve"> / Qwen3-Embedding-8B</w:t>
             </w:r>
           </w:p>
         </w:tc>
@@ -2964,8 +3182,13 @@
             <w:hideMark/>
           </w:tcPr>
           <w:p>
-            <w:r>
-              <w:t>Nebius-hosted instruction LLM</w:t>
+            <w:proofErr w:type="spellStart"/>
+            <w:r>
+              <w:t>Nebius</w:t>
+            </w:r>
+            <w:proofErr w:type="spellEnd"/>
+            <w:r>
+              <w:t>-hosted instruction LLM</w:t>
             </w:r>
           </w:p>
         </w:tc>
@@ -2993,8 +3216,13 @@
             <w:hideMark/>
           </w:tcPr>
           <w:p>
-            <w:r>
-              <w:t>Nebius-hosted instruction LLM</w:t>
+            <w:proofErr w:type="spellStart"/>
+            <w:r>
+              <w:t>Nebius</w:t>
+            </w:r>
+            <w:proofErr w:type="spellEnd"/>
+            <w:r>
+              <w:t>-hosted instruction LLM</w:t>
             </w:r>
           </w:p>
         </w:tc>
@@ -3022,9 +3250,11 @@
             <w:hideMark/>
           </w:tcPr>
           <w:p>
+            <w:proofErr w:type="spellStart"/>
             <w:r>
               <w:t>LangGraph</w:t>
             </w:r>
+            <w:proofErr w:type="spellEnd"/>
           </w:p>
         </w:tc>
       </w:tr>
@@ -3271,7 +3501,21 @@
         <w:rPr>
           <w:color w:val="0F4761" w:themeColor="accent1" w:themeShade="BF"/>
         </w:rPr>
-        <w:t xml:space="preserve"> Evaluation identified that multi-entity comparison questions could retrieve strong evidence for one entity while under-representing the other. The retrieval pipeline was extended to detect comparison queries, decompose them into entity-specific subqueries, retrieve evidence for both sides, preserve balanced evidence, merge and deduplicate candidates, and rerank them against the original question. On retesting, previously problematic comparison cases such as </w:t>
+        <w:t xml:space="preserve"> Evaluation identified that multi-entity comparison questions could retrieve strong evidence for one entity while under-representing the other. The retrieval pipeline was extended to detect comparison queries, decompose them into entity-specific subqueries, retrieve evidence for both sides, preserve balanced evidence, merge and deduplicate candidates, and </w:t>
+      </w:r>
+      <w:proofErr w:type="spellStart"/>
+      <w:r>
+        <w:rPr>
+          <w:color w:val="0F4761" w:themeColor="accent1" w:themeShade="BF"/>
+        </w:rPr>
+        <w:t>rerank</w:t>
+      </w:r>
+      <w:proofErr w:type="spellEnd"/>
+      <w:r>
+        <w:rPr>
+          <w:color w:val="0F4761" w:themeColor="accent1" w:themeShade="BF"/>
+        </w:rPr>
+        <w:t xml:space="preserve"> them against the original question. On retesting, previously problematic comparison cases such as </w:t>
       </w:r>
       <w:r>
         <w:rPr>
@@ -3288,14 +3532,34 @@
         </w:rPr>
         <w:t xml:space="preserve"> and </w:t>
       </w:r>
+      <w:proofErr w:type="spellStart"/>
       <w:r>
         <w:rPr>
           <w:b/>
           <w:bCs/>
           <w:color w:val="0F4761" w:themeColor="accent1" w:themeShade="BF"/>
         </w:rPr>
-        <w:t>CustomerBill vs CustomerBillOnDemand</w:t>
-      </w:r>
+        <w:t>CustomerBill</w:t>
+      </w:r>
+      <w:proofErr w:type="spellEnd"/>
+      <w:r>
+        <w:rPr>
+          <w:b/>
+          <w:bCs/>
+          <w:color w:val="0F4761" w:themeColor="accent1" w:themeShade="BF"/>
+        </w:rPr>
+        <w:t xml:space="preserve"> vs </w:t>
+      </w:r>
+      <w:proofErr w:type="spellStart"/>
+      <w:r>
+        <w:rPr>
+          <w:b/>
+          <w:bCs/>
+          <w:color w:val="0F4761" w:themeColor="accent1" w:themeShade="BF"/>
+        </w:rPr>
+        <w:t>CustomerBillOnDemand</w:t>
+      </w:r>
+      <w:proofErr w:type="spellEnd"/>
       <w:r>
         <w:rPr>
           <w:color w:val="0F4761" w:themeColor="accent1" w:themeShade="BF"/>
@@ -3660,7 +3924,31 @@
     </w:p>
     <w:p>
       <w:r>
-        <w:t>Questions such as Payment vs Refund, CustomerBill vs CustomerBillOnDemand, and BillingAccount vs Customer exposed this imbalance.</w:t>
+        <w:t xml:space="preserve">Questions such as Payment vs Refund, </w:t>
+      </w:r>
+      <w:proofErr w:type="spellStart"/>
+      <w:r>
+        <w:t>CustomerBill</w:t>
+      </w:r>
+      <w:proofErr w:type="spellEnd"/>
+      <w:r>
+        <w:t xml:space="preserve"> vs </w:t>
+      </w:r>
+      <w:proofErr w:type="spellStart"/>
+      <w:r>
+        <w:t>CustomerBillOnDemand</w:t>
+      </w:r>
+      <w:proofErr w:type="spellEnd"/>
+      <w:r>
+        <w:t xml:space="preserve">, and </w:t>
+      </w:r>
+      <w:proofErr w:type="spellStart"/>
+      <w:r>
+        <w:t>BillingAccount</w:t>
+      </w:r>
+      <w:proofErr w:type="spellEnd"/>
+      <w:r>
+        <w:t xml:space="preserve"> vs Customer exposed this imbalance.</w:t>
       </w:r>
     </w:p>
     <w:p>
@@ -3675,7 +3963,15 @@
     </w:p>
     <w:p>
       <w:r>
-        <w:t>The resulting evidence is passed to the LangGraph sufficiency check.</w:t>
+        <w:t xml:space="preserve">The resulting evidence is passed to the </w:t>
+      </w:r>
+      <w:proofErr w:type="spellStart"/>
+      <w:r>
+        <w:t>LangGraph</w:t>
+      </w:r>
+      <w:proofErr w:type="spellEnd"/>
+      <w:r>
+        <w:t xml:space="preserve"> sufficiency check.</w:t>
       </w:r>
     </w:p>
     <w:p>
@@ -4118,10 +4414,12 @@
       <w:r>
         <w:t>five-API knowledge-</w:t>
       </w:r>
+      <w:proofErr w:type="spellStart"/>
       <w:proofErr w:type="gramStart"/>
       <w:r>
         <w:t>base</w:t>
       </w:r>
+      <w:proofErr w:type="spellEnd"/>
       <w:proofErr w:type="gramEnd"/>
       <w:r>
         <w:t xml:space="preserve"> </w:t>
@@ -4509,14 +4807,11 @@
     <w:p/>
     <w:p>
       <w:r>
-        <w:rPr>
-          <w:noProof/>
-        </w:rPr>
         <w:drawing>
-          <wp:inline distT="0" distB="0" distL="0" distR="0" wp14:anchorId="31746AF5" wp14:editId="3D34FE0D">
-            <wp:extent cx="5943600" cy="2726055"/>
-            <wp:effectExtent l="0" t="0" r="0" b="0"/>
-            <wp:docPr id="665196260" name="Picture 1" descr="A screenshot of a computer&#10;&#10;AI-generated content may be incorrect."/>
+          <wp:inline distT="0" distB="0" distL="0" distR="0" wp14:anchorId="5AAF05D2" wp14:editId="3C4918B4">
+            <wp:extent cx="5943600" cy="2981960"/>
+            <wp:effectExtent l="0" t="0" r="0" b="8890"/>
+            <wp:docPr id="882254120" name="Picture 2" descr="A screenshot of a computer&#10;&#10;AI-generated content may be incorrect."/>
             <wp:cNvGraphicFramePr>
               <a:graphicFrameLocks xmlns:a="http://schemas.openxmlformats.org/drawingml/2006/main" noChangeAspect="1"/>
             </wp:cNvGraphicFramePr>
@@ -4524,23 +4819,36 @@
               <a:graphicData uri="http://schemas.openxmlformats.org/drawingml/2006/picture">
                 <pic:pic xmlns:pic="http://schemas.openxmlformats.org/drawingml/2006/picture">
                   <pic:nvPicPr>
-                    <pic:cNvPr id="665196260" name="Picture 1" descr="A screenshot of a computer&#10;&#10;AI-generated content may be incorrect."/>
-                    <pic:cNvPicPr/>
+                    <pic:cNvPr id="882254120" name="Picture 2" descr="A screenshot of a computer&#10;&#10;AI-generated content may be incorrect."/>
+                    <pic:cNvPicPr>
+                      <a:picLocks noChangeAspect="1" noChangeArrowheads="1"/>
+                    </pic:cNvPicPr>
                   </pic:nvPicPr>
                   <pic:blipFill>
-                    <a:blip r:embed="rId5"/>
+                    <a:blip r:embed="rId5" cstate="print">
+                      <a:extLst>
+                        <a:ext uri="{28A0092B-C50C-407E-A947-70E740481C1C}">
+                          <a14:useLocalDpi xmlns:a14="http://schemas.microsoft.com/office/drawing/2010/main" val="0"/>
+                        </a:ext>
+                      </a:extLst>
+                    </a:blip>
+                    <a:srcRect/>
                     <a:stretch>
                       <a:fillRect/>
                     </a:stretch>
                   </pic:blipFill>
-                  <pic:spPr>
+                  <pic:spPr bwMode="auto">
                     <a:xfrm>
                       <a:off x="0" y="0"/>
-                      <a:ext cx="5943600" cy="2726055"/>
+                      <a:ext cx="5943600" cy="2981960"/>
                     </a:xfrm>
                     <a:prstGeom prst="rect">
                       <a:avLst/>
                     </a:prstGeom>
+                    <a:noFill/>
+                    <a:ln>
+                      <a:noFill/>
+                    </a:ln>
                   </pic:spPr>
                 </pic:pic>
               </a:graphicData>
@@ -4550,17 +4858,15 @@
       </w:r>
     </w:p>
     <w:p/>
-    <w:p>
-      <w:r>
-        <w:rPr>
-          <w:noProof/>
-        </w:rPr>
+    <w:p/>
+    <w:p>
+      <w:r>
         <w:lastRenderedPageBreak/>
         <w:drawing>
-          <wp:inline distT="0" distB="0" distL="0" distR="0" wp14:anchorId="292121A6" wp14:editId="69CBF7A8">
-            <wp:extent cx="5943600" cy="2949575"/>
-            <wp:effectExtent l="0" t="0" r="0" b="3175"/>
-            <wp:docPr id="344653745" name="Picture 1" descr="A screenshot of a computer&#10;&#10;AI-generated content may be incorrect."/>
+          <wp:inline distT="0" distB="0" distL="0" distR="0" wp14:anchorId="14603436" wp14:editId="588EA6B8">
+            <wp:extent cx="5943600" cy="2716530"/>
+            <wp:effectExtent l="0" t="0" r="0" b="7620"/>
+            <wp:docPr id="789123447" name="Picture 4" descr="A screenshot of a computer&#10;&#10;AI-generated content may be incorrect."/>
             <wp:cNvGraphicFramePr>
               <a:graphicFrameLocks xmlns:a="http://schemas.openxmlformats.org/drawingml/2006/main" noChangeAspect="1"/>
             </wp:cNvGraphicFramePr>
@@ -4568,23 +4874,36 @@
               <a:graphicData uri="http://schemas.openxmlformats.org/drawingml/2006/picture">
                 <pic:pic xmlns:pic="http://schemas.openxmlformats.org/drawingml/2006/picture">
                   <pic:nvPicPr>
-                    <pic:cNvPr id="344653745" name="Picture 1" descr="A screenshot of a computer&#10;&#10;AI-generated content may be incorrect."/>
-                    <pic:cNvPicPr/>
+                    <pic:cNvPr id="789123447" name="Picture 4" descr="A screenshot of a computer&#10;&#10;AI-generated content may be incorrect."/>
+                    <pic:cNvPicPr>
+                      <a:picLocks noChangeAspect="1" noChangeArrowheads="1"/>
+                    </pic:cNvPicPr>
                   </pic:nvPicPr>
                   <pic:blipFill>
-                    <a:blip r:embed="rId6"/>
+                    <a:blip r:embed="rId6" cstate="print">
+                      <a:extLst>
+                        <a:ext uri="{28A0092B-C50C-407E-A947-70E740481C1C}">
+                          <a14:useLocalDpi xmlns:a14="http://schemas.microsoft.com/office/drawing/2010/main" val="0"/>
+                        </a:ext>
+                      </a:extLst>
+                    </a:blip>
+                    <a:srcRect/>
                     <a:stretch>
                       <a:fillRect/>
                     </a:stretch>
                   </pic:blipFill>
-                  <pic:spPr>
+                  <pic:spPr bwMode="auto">
                     <a:xfrm>
                       <a:off x="0" y="0"/>
-                      <a:ext cx="5943600" cy="2949575"/>
+                      <a:ext cx="5943600" cy="2716530"/>
                     </a:xfrm>
                     <a:prstGeom prst="rect">
                       <a:avLst/>
                     </a:prstGeom>
+                    <a:noFill/>
+                    <a:ln>
+                      <a:noFill/>
+                    </a:ln>
                   </pic:spPr>
                 </pic:pic>
               </a:graphicData>
@@ -4593,6 +4912,7 @@
         </w:drawing>
       </w:r>
     </w:p>
+    <w:p/>
     <w:p/>
     <w:sectPr>
       <w:pgSz w:w="12240" w:h="15840"/>
@@ -6175,7 +6495,6 @@
   <w:style w:type="character" w:default="1" w:styleId="DefaultParagraphFont">
     <w:name w:val="Default Paragraph Font"/>
     <w:uiPriority w:val="1"/>
-    <w:semiHidden/>
     <w:unhideWhenUsed/>
   </w:style>
   <w:style w:type="table" w:default="1" w:styleId="TableNormal">

</xml_diff>